<commit_message>
yang acc, di surat pengembalian juga harus sama acc ttdnya
</commit_message>
<xml_diff>
--- a/backend/assets/Surat-Pengembalian-BMN.docx
+++ b/backend/assets/Surat-Pengembalian-BMN.docx
@@ -1,6 +1,6 @@
 
 <file path=word/document.xml><?xml version="1.0" encoding="utf-8"?>
-<w:document xmlns:wpc="http://schemas.microsoft.com/office/word/2010/wordprocessingCanvas" xmlns:cx="http://schemas.microsoft.com/office/drawing/2014/chartex" xmlns:cx1="http://schemas.microsoft.com/office/drawing/2015/9/8/chartex" xmlns:cx2="http://schemas.microsoft.com/office/drawing/2015/10/21/chartex" xmlns:cx3="http://schemas.microsoft.com/office/drawing/2016/5/9/chartex" xmlns:cx4="http://schemas.microsoft.com/office/drawing/2016/5/10/chartex" xmlns:cx5="http://schemas.microsoft.com/office/drawing/2016/5/11/chartex" xmlns:cx6="http://schemas.microsoft.com/office/drawing/2016/5/12/chartex" xmlns:cx7="http://schemas.microsoft.com/office/drawing/2016/5/13/chartex" xmlns:cx8="http://schemas.microsoft.com/office/drawing/2016/5/14/chartex" xmlns:mc="http://schemas.openxmlformats.org/markup-compatibility/2006" xmlns:aink="http://schemas.microsoft.com/office/drawing/2016/ink" xmlns:am3d="http://schemas.microsoft.com/office/drawing/2017/model3d" xmlns:o="urn:schemas-microsoft-com:office:office" xmlns:r="http://schemas.openxmlformats.org/officeDocument/2006/relationships" xmlns:m="http://schemas.openxmlformats.org/officeDocument/2006/math" xmlns:v="urn:schemas-microsoft-com:vml" xmlns:wp14="http://schemas.microsoft.com/office/word/2010/wordprocessingDrawing" xmlns:wp="http://schemas.openxmlformats.org/drawingml/2006/wordprocessingDrawing" xmlns:w10="urn:schemas-microsoft-com:office:word" xmlns:w="http://schemas.openxmlformats.org/wordprocessingml/2006/main" xmlns:w14="http://schemas.microsoft.com/office/word/2010/wordml" xmlns:w15="http://schemas.microsoft.com/office/word/2012/wordml" xmlns:w16cex="http://schemas.microsoft.com/office/word/2018/wordml/cex" xmlns:w16cid="http://schemas.microsoft.com/office/word/2016/wordml/cid" xmlns:w16="http://schemas.microsoft.com/office/word/2018/wordml" xmlns:w16sdtdh="http://schemas.microsoft.com/office/word/2020/wordml/sdtdatahash" xmlns:w16se="http://schemas.microsoft.com/office/word/2015/wordml/symex" xmlns:wpg="http://schemas.microsoft.com/office/word/2010/wordprocessingGroup" xmlns:wpi="http://schemas.microsoft.com/office/word/2010/wordprocessingInk" xmlns:wne="http://schemas.microsoft.com/office/word/2006/wordml" xmlns:wps="http://schemas.microsoft.com/office/word/2010/wordprocessingShape" mc:Ignorable="w14 w15 w16se w16cid w16 w16cex w16sdtdh wp14">
+<w:document xmlns:wpc="http://schemas.microsoft.com/office/word/2010/wordprocessingCanvas" xmlns:cx="http://schemas.microsoft.com/office/drawing/2014/chartex" xmlns:cx1="http://schemas.microsoft.com/office/drawing/2015/9/8/chartex" xmlns:cx2="http://schemas.microsoft.com/office/drawing/2015/10/21/chartex" xmlns:cx3="http://schemas.microsoft.com/office/drawing/2016/5/9/chartex" xmlns:cx4="http://schemas.microsoft.com/office/drawing/2016/5/10/chartex" xmlns:cx5="http://schemas.microsoft.com/office/drawing/2016/5/11/chartex" xmlns:cx6="http://schemas.microsoft.com/office/drawing/2016/5/12/chartex" xmlns:cx7="http://schemas.microsoft.com/office/drawing/2016/5/13/chartex" xmlns:cx8="http://schemas.microsoft.com/office/drawing/2016/5/14/chartex" xmlns:mc="http://schemas.openxmlformats.org/markup-compatibility/2006" xmlns:aink="http://schemas.microsoft.com/office/drawing/2016/ink" xmlns:am3d="http://schemas.microsoft.com/office/drawing/2017/model3d" xmlns:o="urn:schemas-microsoft-com:office:office" xmlns:oel="http://schemas.microsoft.com/office/2019/extlst" xmlns:r="http://schemas.openxmlformats.org/officeDocument/2006/relationships" xmlns:m="http://schemas.openxmlformats.org/officeDocument/2006/math" xmlns:v="urn:schemas-microsoft-com:vml" xmlns:wp14="http://schemas.microsoft.com/office/word/2010/wordprocessingDrawing" xmlns:wp="http://schemas.openxmlformats.org/drawingml/2006/wordprocessingDrawing" xmlns:w10="urn:schemas-microsoft-com:office:word" xmlns:w="http://schemas.openxmlformats.org/wordprocessingml/2006/main" xmlns:w14="http://schemas.microsoft.com/office/word/2010/wordml" xmlns:w15="http://schemas.microsoft.com/office/word/2012/wordml" xmlns:w16cex="http://schemas.microsoft.com/office/word/2018/wordml/cex" xmlns:w16cid="http://schemas.microsoft.com/office/word/2016/wordml/cid" xmlns:w16="http://schemas.microsoft.com/office/word/2018/wordml" xmlns:w16du="http://schemas.microsoft.com/office/word/2023/wordml/word16du" xmlns:w16sdtdh="http://schemas.microsoft.com/office/word/2020/wordml/sdtdatahash" xmlns:w16sdtfl="http://schemas.microsoft.com/office/word/2024/wordml/sdtformatlock" xmlns:w16se="http://schemas.microsoft.com/office/word/2015/wordml/symex" xmlns:wpg="http://schemas.microsoft.com/office/word/2010/wordprocessingGroup" xmlns:wpi="http://schemas.microsoft.com/office/word/2010/wordprocessingInk" xmlns:wne="http://schemas.microsoft.com/office/word/2006/wordml" xmlns:wps="http://schemas.microsoft.com/office/word/2010/wordprocessingShape" mc:Ignorable="w14 w15 w16se w16cid w16 w16cex w16sdtdh w16sdtfl w16du wp14">
   <w:body>
     <w:p>
       <w:pPr>
@@ -194,38 +194,99 @@
           <w:rFonts w:ascii="Arial" w:hAnsi="Arial" w:cs="Arial"/>
         </w:rPr>
       </w:pPr>
+      <w:r>
+        <w:rPr>
+          <w:rFonts w:ascii="Arial" w:hAnsi="Arial" w:cs="Arial"/>
+        </w:rPr>
+        <w:t>nama</w:t>
+      </w:r>
+      <w:r>
+        <w:rPr>
+          <w:rFonts w:ascii="Arial" w:hAnsi="Arial" w:cs="Arial"/>
+        </w:rPr>
+        <w:tab/>
+      </w:r>
+      <w:r>
+        <w:rPr>
+          <w:rFonts w:ascii="Arial" w:hAnsi="Arial" w:cs="Arial"/>
+        </w:rPr>
+        <w:tab/>
+      </w:r>
+      <w:r>
+        <w:rPr>
+          <w:rFonts w:ascii="Arial" w:hAnsi="Arial" w:cs="Arial"/>
+        </w:rPr>
+        <w:t xml:space="preserve">: </w:t>
+      </w:r>
+      <w:r>
+        <w:rPr>
+          <w:rFonts w:ascii="Arial" w:hAnsi="Arial" w:cs="Arial"/>
+        </w:rPr>
+        <w:t xml:space="preserve">[ </w:t>
+      </w:r>
+      <w:r>
+        <w:rPr>
+          <w:rFonts w:ascii="Arial" w:hAnsi="Arial" w:cs="Arial"/>
+          <w:color w:val="EE0000"/>
+        </w:rPr>
+        <w:t xml:space="preserve">yang </w:t>
+      </w:r>
       <w:proofErr w:type="spellStart"/>
       <w:r>
         <w:rPr>
           <w:rFonts w:ascii="Arial" w:hAnsi="Arial" w:cs="Arial"/>
-        </w:rPr>
-        <w:t>nama</w:t>
+          <w:color w:val="EE0000"/>
+        </w:rPr>
+        <w:t>melakukan</w:t>
       </w:r>
       <w:proofErr w:type="spellEnd"/>
       <w:r>
         <w:rPr>
           <w:rFonts w:ascii="Arial" w:hAnsi="Arial" w:cs="Arial"/>
-        </w:rPr>
-        <w:tab/>
-      </w:r>
-      <w:r>
-        <w:rPr>
-          <w:rFonts w:ascii="Arial" w:hAnsi="Arial" w:cs="Arial"/>
-        </w:rPr>
-        <w:tab/>
-      </w:r>
-      <w:r>
-        <w:rPr>
-          <w:rFonts w:ascii="Arial" w:hAnsi="Arial" w:cs="Arial"/>
-        </w:rPr>
-        <w:t xml:space="preserve">: </w:t>
-      </w:r>
-      <w:r>
-        <w:rPr>
-          <w:rFonts w:ascii="Arial" w:hAnsi="Arial" w:cs="Arial"/>
-        </w:rPr>
-        <w:t>Taufan Sukma Nugraha</w:t>
-      </w:r>
+          <w:color w:val="EE0000"/>
+        </w:rPr>
+        <w:t xml:space="preserve"> </w:t>
+      </w:r>
+      <w:proofErr w:type="spellStart"/>
+      <w:r>
+        <w:rPr>
+          <w:rFonts w:ascii="Arial" w:hAnsi="Arial" w:cs="Arial"/>
+          <w:color w:val="EE0000"/>
+        </w:rPr>
+        <w:t>acc</w:t>
+      </w:r>
+      <w:proofErr w:type="spellEnd"/>
+      <w:r>
+        <w:rPr>
+          <w:rFonts w:ascii="Arial" w:hAnsi="Arial" w:cs="Arial"/>
+          <w:color w:val="EE0000"/>
+        </w:rPr>
+        <w:t>/</w:t>
+      </w:r>
+      <w:proofErr w:type="spellStart"/>
+      <w:proofErr w:type="gramStart"/>
+      <w:r>
+        <w:rPr>
+          <w:rFonts w:ascii="Arial" w:hAnsi="Arial" w:cs="Arial"/>
+          <w:color w:val="EE0000"/>
+        </w:rPr>
+        <w:t>setujui</w:t>
+      </w:r>
+      <w:proofErr w:type="spellEnd"/>
+      <w:r>
+        <w:rPr>
+          <w:rFonts w:ascii="Arial" w:hAnsi="Arial" w:cs="Arial"/>
+          <w:color w:val="EE0000"/>
+        </w:rPr>
+        <w:t xml:space="preserve"> </w:t>
+      </w:r>
+      <w:r>
+        <w:rPr>
+          <w:rFonts w:ascii="Arial" w:hAnsi="Arial" w:cs="Arial"/>
+        </w:rPr>
+        <w:t>]</w:t>
+      </w:r>
+      <w:proofErr w:type="gramEnd"/>
     </w:p>
     <w:p>
       <w:pPr>
@@ -267,16 +328,69 @@
       <w:r>
         <w:rPr>
           <w:rFonts w:ascii="Arial" w:hAnsi="Arial" w:cs="Arial"/>
-          <w:lang w:val="en-US"/>
-        </w:rPr>
-        <w:t>19</w:t>
-      </w:r>
-      <w:r>
-        <w:rPr>
-          <w:rFonts w:ascii="Arial" w:hAnsi="Arial" w:cs="Arial"/>
-          <w:lang w:val="en-US"/>
-        </w:rPr>
-        <w:t>8605132007011001</w:t>
+        </w:rPr>
+        <w:t xml:space="preserve">[ </w:t>
+      </w:r>
+      <w:r>
+        <w:rPr>
+          <w:rFonts w:ascii="Arial" w:hAnsi="Arial" w:cs="Arial"/>
+          <w:color w:val="EE0000"/>
+        </w:rPr>
+        <w:t xml:space="preserve">yang </w:t>
+      </w:r>
+      <w:proofErr w:type="spellStart"/>
+      <w:r>
+        <w:rPr>
+          <w:rFonts w:ascii="Arial" w:hAnsi="Arial" w:cs="Arial"/>
+          <w:color w:val="EE0000"/>
+        </w:rPr>
+        <w:t>melakukan</w:t>
+      </w:r>
+      <w:proofErr w:type="spellEnd"/>
+      <w:r>
+        <w:rPr>
+          <w:rFonts w:ascii="Arial" w:hAnsi="Arial" w:cs="Arial"/>
+          <w:color w:val="EE0000"/>
+        </w:rPr>
+        <w:t xml:space="preserve"> </w:t>
+      </w:r>
+      <w:proofErr w:type="spellStart"/>
+      <w:r>
+        <w:rPr>
+          <w:rFonts w:ascii="Arial" w:hAnsi="Arial" w:cs="Arial"/>
+          <w:color w:val="EE0000"/>
+        </w:rPr>
+        <w:t>acc</w:t>
+      </w:r>
+      <w:proofErr w:type="spellEnd"/>
+      <w:r>
+        <w:rPr>
+          <w:rFonts w:ascii="Arial" w:hAnsi="Arial" w:cs="Arial"/>
+          <w:color w:val="EE0000"/>
+        </w:rPr>
+        <w:t>/</w:t>
+      </w:r>
+      <w:proofErr w:type="spellStart"/>
+      <w:r>
+        <w:rPr>
+          <w:rFonts w:ascii="Arial" w:hAnsi="Arial" w:cs="Arial"/>
+          <w:color w:val="EE0000"/>
+        </w:rPr>
+        <w:t>setujui</w:t>
+      </w:r>
+      <w:proofErr w:type="spellEnd"/>
+      <w:r>
+        <w:rPr>
+          <w:rFonts w:ascii="Arial" w:hAnsi="Arial" w:cs="Arial"/>
+          <w:color w:val="EE0000"/>
+        </w:rPr>
+        <w:t xml:space="preserve"> </w:t>
+      </w:r>
+      <w:r>
+        <w:rPr>
+          <w:rFonts w:ascii="Arial" w:hAnsi="Arial" w:cs="Arial"/>
+        </w:rPr>
+        <w:t>]</w:t>
       </w:r>
     </w:p>
     <w:p>
@@ -314,19 +428,72 @@
         <w:tab/>
         <w:t xml:space="preserve">: </w:t>
       </w:r>
+      <w:r>
+        <w:rPr>
+          <w:rFonts w:ascii="Arial" w:hAnsi="Arial" w:cs="Arial"/>
+        </w:rPr>
+        <w:t xml:space="preserve">[ </w:t>
+      </w:r>
+      <w:r>
+        <w:rPr>
+          <w:rFonts w:ascii="Arial" w:hAnsi="Arial" w:cs="Arial"/>
+          <w:color w:val="EE0000"/>
+        </w:rPr>
+        <w:t xml:space="preserve">yang </w:t>
+      </w:r>
       <w:proofErr w:type="spellStart"/>
       <w:r>
         <w:rPr>
           <w:rFonts w:ascii="Arial" w:hAnsi="Arial" w:cs="Arial"/>
-        </w:rPr>
-        <w:t>Sekretariat</w:t>
+          <w:color w:val="EE0000"/>
+        </w:rPr>
+        <w:t>melakukan</w:t>
       </w:r>
       <w:proofErr w:type="spellEnd"/>
       <w:r>
         <w:rPr>
           <w:rFonts w:ascii="Arial" w:hAnsi="Arial" w:cs="Arial"/>
-        </w:rPr>
-        <w:t xml:space="preserve"> BPPK</w:t>
+          <w:color w:val="EE0000"/>
+        </w:rPr>
+        <w:t xml:space="preserve"> </w:t>
+      </w:r>
+      <w:proofErr w:type="spellStart"/>
+      <w:r>
+        <w:rPr>
+          <w:rFonts w:ascii="Arial" w:hAnsi="Arial" w:cs="Arial"/>
+          <w:color w:val="EE0000"/>
+        </w:rPr>
+        <w:t>acc</w:t>
+      </w:r>
+      <w:proofErr w:type="spellEnd"/>
+      <w:r>
+        <w:rPr>
+          <w:rFonts w:ascii="Arial" w:hAnsi="Arial" w:cs="Arial"/>
+          <w:color w:val="EE0000"/>
+        </w:rPr>
+        <w:t>/</w:t>
+      </w:r>
+      <w:proofErr w:type="spellStart"/>
+      <w:r>
+        <w:rPr>
+          <w:rFonts w:ascii="Arial" w:hAnsi="Arial" w:cs="Arial"/>
+          <w:color w:val="EE0000"/>
+        </w:rPr>
+        <w:t>setujui</w:t>
+      </w:r>
+      <w:proofErr w:type="spellEnd"/>
+      <w:r>
+        <w:rPr>
+          <w:rFonts w:ascii="Arial" w:hAnsi="Arial" w:cs="Arial"/>
+          <w:color w:val="EE0000"/>
+        </w:rPr>
+        <w:t xml:space="preserve"> </w:t>
+      </w:r>
+      <w:r>
+        <w:rPr>
+          <w:rFonts w:ascii="Arial" w:hAnsi="Arial" w:cs="Arial"/>
+        </w:rPr>
+        <w:t>]</w:t>
       </w:r>
     </w:p>
     <w:p>
@@ -358,14 +525,73 @@
         <w:tab/>
         <w:t xml:space="preserve">: </w:t>
       </w:r>
+      <w:r>
+        <w:rPr>
+          <w:rFonts w:ascii="Arial" w:hAnsi="Arial" w:cs="Arial"/>
+        </w:rPr>
+        <w:t xml:space="preserve">[ </w:t>
+      </w:r>
+      <w:r>
+        <w:rPr>
+          <w:rFonts w:ascii="Arial" w:hAnsi="Arial" w:cs="Arial"/>
+          <w:color w:val="EE0000"/>
+        </w:rPr>
+        <w:t xml:space="preserve">yang </w:t>
+      </w:r>
       <w:proofErr w:type="spellStart"/>
       <w:r>
         <w:rPr>
           <w:rFonts w:ascii="Arial" w:hAnsi="Arial" w:cs="Arial"/>
-        </w:rPr>
-        <w:t>Umum</w:t>
+          <w:color w:val="EE0000"/>
+        </w:rPr>
+        <w:t>melakukan</w:t>
       </w:r>
       <w:proofErr w:type="spellEnd"/>
+      <w:r>
+        <w:rPr>
+          <w:rFonts w:ascii="Arial" w:hAnsi="Arial" w:cs="Arial"/>
+          <w:color w:val="EE0000"/>
+        </w:rPr>
+        <w:t xml:space="preserve"> </w:t>
+      </w:r>
+      <w:proofErr w:type="spellStart"/>
+      <w:r>
+        <w:rPr>
+          <w:rFonts w:ascii="Arial" w:hAnsi="Arial" w:cs="Arial"/>
+          <w:color w:val="EE0000"/>
+        </w:rPr>
+        <w:t>acc</w:t>
+      </w:r>
+      <w:proofErr w:type="spellEnd"/>
+      <w:r>
+        <w:rPr>
+          <w:rFonts w:ascii="Arial" w:hAnsi="Arial" w:cs="Arial"/>
+          <w:color w:val="EE0000"/>
+        </w:rPr>
+        <w:t>/</w:t>
+      </w:r>
+      <w:proofErr w:type="spellStart"/>
+      <w:r>
+        <w:rPr>
+          <w:rFonts w:ascii="Arial" w:hAnsi="Arial" w:cs="Arial"/>
+          <w:color w:val="EE0000"/>
+        </w:rPr>
+        <w:t>setujui</w:t>
+      </w:r>
+      <w:proofErr w:type="spellEnd"/>
+      <w:r>
+        <w:rPr>
+          <w:rFonts w:ascii="Arial" w:hAnsi="Arial" w:cs="Arial"/>
+          <w:color w:val="EE0000"/>
+        </w:rPr>
+        <w:t xml:space="preserve"> </w:t>
+      </w:r>
+      <w:r>
+        <w:rPr>
+          <w:rFonts w:ascii="Arial" w:hAnsi="Arial" w:cs="Arial"/>
+        </w:rPr>
+        <w:t>]</w:t>
+      </w:r>
     </w:p>
     <w:p>
       <w:pPr>
@@ -431,14 +657,12 @@
           <w:rFonts w:ascii="Arial" w:hAnsi="Arial" w:cs="Arial"/>
         </w:rPr>
       </w:pPr>
-      <w:proofErr w:type="spellStart"/>
       <w:r>
         <w:rPr>
           <w:rFonts w:ascii="Arial" w:hAnsi="Arial" w:cs="Arial"/>
         </w:rPr>
         <w:t>nama</w:t>
       </w:r>
-      <w:proofErr w:type="spellEnd"/>
       <w:r>
         <w:rPr>
           <w:rFonts w:ascii="Arial" w:hAnsi="Arial" w:cs="Arial"/>
@@ -1489,17 +1713,68 @@
               <w:rPr>
                 <w:rFonts w:ascii="Arial" w:hAnsi="Arial" w:cs="Arial"/>
               </w:rPr>
-              <w:t>Taufan Sukma Nugraha</w:t>
-            </w:r>
-          </w:p>
-          <w:p>
-            <w:pPr>
-              <w:ind w:left="73"/>
-              <w:rPr>
-                <w:rFonts w:ascii="Arial" w:hAnsi="Arial" w:cs="Arial"/>
-                <w:lang w:val="id-ID"/>
-              </w:rPr>
-            </w:pPr>
+              <w:t xml:space="preserve">[ </w:t>
+            </w:r>
+            <w:r>
+              <w:rPr>
+                <w:rFonts w:ascii="Arial" w:hAnsi="Arial" w:cs="Arial"/>
+                <w:color w:val="EE0000"/>
+              </w:rPr>
+              <w:t xml:space="preserve">nama </w:t>
+            </w:r>
+            <w:r>
+              <w:rPr>
+                <w:rFonts w:ascii="Arial" w:hAnsi="Arial" w:cs="Arial"/>
+                <w:color w:val="EE0000"/>
+              </w:rPr>
+              <w:t>yang melakukan a</w:t>
+            </w:r>
+            <w:proofErr w:type="spellStart"/>
+            <w:r>
+              <w:rPr>
+                <w:rFonts w:ascii="Arial" w:hAnsi="Arial" w:cs="Arial"/>
+                <w:color w:val="EE0000"/>
+              </w:rPr>
+              <w:t>cc</w:t>
+            </w:r>
+            <w:proofErr w:type="spellEnd"/>
+            <w:r>
+              <w:rPr>
+                <w:rFonts w:ascii="Arial" w:hAnsi="Arial" w:cs="Arial"/>
+                <w:color w:val="EE0000"/>
+              </w:rPr>
+              <w:t>/</w:t>
+            </w:r>
+            <w:proofErr w:type="spellStart"/>
+            <w:proofErr w:type="gramStart"/>
+            <w:r>
+              <w:rPr>
+                <w:rFonts w:ascii="Arial" w:hAnsi="Arial" w:cs="Arial"/>
+                <w:color w:val="EE0000"/>
+              </w:rPr>
+              <w:t>setujui</w:t>
+            </w:r>
+            <w:proofErr w:type="spellEnd"/>
+            <w:r>
+              <w:rPr>
+                <w:rFonts w:ascii="Arial" w:hAnsi="Arial" w:cs="Arial"/>
+                <w:color w:val="EE0000"/>
+              </w:rPr>
+              <w:t xml:space="preserve"> </w:t>
+            </w:r>
+            <w:r>
+              <w:rPr>
+                <w:rFonts w:ascii="Arial" w:hAnsi="Arial" w:cs="Arial"/>
+              </w:rPr>
+              <w:t>]</w:t>
+            </w:r>
+            <w:proofErr w:type="gramEnd"/>
+            <w:r>
+              <w:rPr>
+                <w:rFonts w:ascii="Arial" w:hAnsi="Arial" w:cs="Arial"/>
+              </w:rPr>
+              <w:t xml:space="preserve">                    </w:t>
+            </w:r>
             <w:r>
               <w:rPr>
                 <w:rFonts w:ascii="Arial" w:hAnsi="Arial" w:cs="Arial"/>
@@ -1509,10 +1784,72 @@
             <w:r>
               <w:rPr>
                 <w:rFonts w:ascii="Arial" w:hAnsi="Arial" w:cs="Arial"/>
-                <w:lang w:val="en-US"/>
-              </w:rPr>
-              <w:t>198605132007011001</w:t>
-            </w:r>
+              </w:rPr>
+              <w:t xml:space="preserve">[ </w:t>
+            </w:r>
+            <w:r>
+              <w:rPr>
+                <w:rFonts w:ascii="Arial" w:hAnsi="Arial" w:cs="Arial"/>
+                <w:color w:val="EE0000"/>
+              </w:rPr>
+              <w:t xml:space="preserve">yang </w:t>
+            </w:r>
+            <w:proofErr w:type="spellStart"/>
+            <w:r>
+              <w:rPr>
+                <w:rFonts w:ascii="Arial" w:hAnsi="Arial" w:cs="Arial"/>
+                <w:color w:val="EE0000"/>
+              </w:rPr>
+              <w:t>melakukan</w:t>
+            </w:r>
+            <w:proofErr w:type="spellEnd"/>
+            <w:r>
+              <w:rPr>
+                <w:rFonts w:ascii="Arial" w:hAnsi="Arial" w:cs="Arial"/>
+                <w:color w:val="EE0000"/>
+              </w:rPr>
+              <w:t xml:space="preserve"> </w:t>
+            </w:r>
+            <w:proofErr w:type="spellStart"/>
+            <w:r>
+              <w:rPr>
+                <w:rFonts w:ascii="Arial" w:hAnsi="Arial" w:cs="Arial"/>
+                <w:color w:val="EE0000"/>
+              </w:rPr>
+              <w:t>acc</w:t>
+            </w:r>
+            <w:proofErr w:type="spellEnd"/>
+            <w:r>
+              <w:rPr>
+                <w:rFonts w:ascii="Arial" w:hAnsi="Arial" w:cs="Arial"/>
+                <w:color w:val="EE0000"/>
+              </w:rPr>
+              <w:t>/</w:t>
+            </w:r>
+            <w:proofErr w:type="spellStart"/>
+            <w:proofErr w:type="gramStart"/>
+            <w:r>
+              <w:rPr>
+                <w:rFonts w:ascii="Arial" w:hAnsi="Arial" w:cs="Arial"/>
+                <w:color w:val="EE0000"/>
+              </w:rPr>
+              <w:t>setujui</w:t>
+            </w:r>
+            <w:proofErr w:type="spellEnd"/>
+            <w:r>
+              <w:rPr>
+                <w:rFonts w:ascii="Arial" w:hAnsi="Arial" w:cs="Arial"/>
+                <w:color w:val="EE0000"/>
+              </w:rPr>
+              <w:t xml:space="preserve"> </w:t>
+            </w:r>
+            <w:r>
+              <w:rPr>
+                <w:rFonts w:ascii="Arial" w:hAnsi="Arial" w:cs="Arial"/>
+              </w:rPr>
+              <w:t>]</w:t>
+            </w:r>
+            <w:proofErr w:type="gramEnd"/>
           </w:p>
           <w:p>
             <w:pPr>
@@ -1547,7 +1884,7 @@
 </file>
 
 <file path=word/endnotes.xml><?xml version="1.0" encoding="utf-8"?>
-<w:endnotes xmlns:wpc="http://schemas.microsoft.com/office/word/2010/wordprocessingCanvas" xmlns:cx="http://schemas.microsoft.com/office/drawing/2014/chartex" xmlns:cx1="http://schemas.microsoft.com/office/drawing/2015/9/8/chartex" xmlns:cx2="http://schemas.microsoft.com/office/drawing/2015/10/21/chartex" xmlns:cx3="http://schemas.microsoft.com/office/drawing/2016/5/9/chartex" xmlns:cx4="http://schemas.microsoft.com/office/drawing/2016/5/10/chartex" xmlns:cx5="http://schemas.microsoft.com/office/drawing/2016/5/11/chartex" xmlns:cx6="http://schemas.microsoft.com/office/drawing/2016/5/12/chartex" xmlns:cx7="http://schemas.microsoft.com/office/drawing/2016/5/13/chartex" xmlns:cx8="http://schemas.microsoft.com/office/drawing/2016/5/14/chartex" xmlns:mc="http://schemas.openxmlformats.org/markup-compatibility/2006" xmlns:aink="http://schemas.microsoft.com/office/drawing/2016/ink" xmlns:am3d="http://schemas.microsoft.com/office/drawing/2017/model3d" xmlns:o="urn:schemas-microsoft-com:office:office" xmlns:r="http://schemas.openxmlformats.org/officeDocument/2006/relationships" xmlns:m="http://schemas.openxmlformats.org/officeDocument/2006/math" xmlns:v="urn:schemas-microsoft-com:vml" xmlns:wp14="http://schemas.microsoft.com/office/word/2010/wordprocessingDrawing" xmlns:wp="http://schemas.openxmlformats.org/drawingml/2006/wordprocessingDrawing" xmlns:w10="urn:schemas-microsoft-com:office:word" xmlns:w="http://schemas.openxmlformats.org/wordprocessingml/2006/main" xmlns:w14="http://schemas.microsoft.com/office/word/2010/wordml" xmlns:w15="http://schemas.microsoft.com/office/word/2012/wordml" xmlns:w16cex="http://schemas.microsoft.com/office/word/2018/wordml/cex" xmlns:w16cid="http://schemas.microsoft.com/office/word/2016/wordml/cid" xmlns:w16="http://schemas.microsoft.com/office/word/2018/wordml" xmlns:w16sdtdh="http://schemas.microsoft.com/office/word/2020/wordml/sdtdatahash" xmlns:w16se="http://schemas.microsoft.com/office/word/2015/wordml/symex" xmlns:wpg="http://schemas.microsoft.com/office/word/2010/wordprocessingGroup" xmlns:wpi="http://schemas.microsoft.com/office/word/2010/wordprocessingInk" xmlns:wne="http://schemas.microsoft.com/office/word/2006/wordml" xmlns:wps="http://schemas.microsoft.com/office/word/2010/wordprocessingShape" mc:Ignorable="w14 w15 w16se w16cid w16 w16cex w16sdtdh wp14">
+<w:endnotes xmlns:wpc="http://schemas.microsoft.com/office/word/2010/wordprocessingCanvas" xmlns:cx="http://schemas.microsoft.com/office/drawing/2014/chartex" xmlns:cx1="http://schemas.microsoft.com/office/drawing/2015/9/8/chartex" xmlns:cx2="http://schemas.microsoft.com/office/drawing/2015/10/21/chartex" xmlns:cx3="http://schemas.microsoft.com/office/drawing/2016/5/9/chartex" xmlns:cx4="http://schemas.microsoft.com/office/drawing/2016/5/10/chartex" xmlns:cx5="http://schemas.microsoft.com/office/drawing/2016/5/11/chartex" xmlns:cx6="http://schemas.microsoft.com/office/drawing/2016/5/12/chartex" xmlns:cx7="http://schemas.microsoft.com/office/drawing/2016/5/13/chartex" xmlns:cx8="http://schemas.microsoft.com/office/drawing/2016/5/14/chartex" xmlns:mc="http://schemas.openxmlformats.org/markup-compatibility/2006" xmlns:aink="http://schemas.microsoft.com/office/drawing/2016/ink" xmlns:am3d="http://schemas.microsoft.com/office/drawing/2017/model3d" xmlns:o="urn:schemas-microsoft-com:office:office" xmlns:oel="http://schemas.microsoft.com/office/2019/extlst" xmlns:r="http://schemas.openxmlformats.org/officeDocument/2006/relationships" xmlns:m="http://schemas.openxmlformats.org/officeDocument/2006/math" xmlns:v="urn:schemas-microsoft-com:vml" xmlns:wp14="http://schemas.microsoft.com/office/word/2010/wordprocessingDrawing" xmlns:wp="http://schemas.openxmlformats.org/drawingml/2006/wordprocessingDrawing" xmlns:w10="urn:schemas-microsoft-com:office:word" xmlns:w="http://schemas.openxmlformats.org/wordprocessingml/2006/main" xmlns:w14="http://schemas.microsoft.com/office/word/2010/wordml" xmlns:w15="http://schemas.microsoft.com/office/word/2012/wordml" xmlns:w16cex="http://schemas.microsoft.com/office/word/2018/wordml/cex" xmlns:w16cid="http://schemas.microsoft.com/office/word/2016/wordml/cid" xmlns:w16="http://schemas.microsoft.com/office/word/2018/wordml" xmlns:w16du="http://schemas.microsoft.com/office/word/2023/wordml/word16du" xmlns:w16sdtdh="http://schemas.microsoft.com/office/word/2020/wordml/sdtdatahash" xmlns:w16sdtfl="http://schemas.microsoft.com/office/word/2024/wordml/sdtformatlock" xmlns:w16se="http://schemas.microsoft.com/office/word/2015/wordml/symex" xmlns:wpg="http://schemas.microsoft.com/office/word/2010/wordprocessingGroup" xmlns:wpi="http://schemas.microsoft.com/office/word/2010/wordprocessingInk" xmlns:wne="http://schemas.microsoft.com/office/word/2006/wordml" xmlns:wps="http://schemas.microsoft.com/office/word/2010/wordprocessingShape" mc:Ignorable="w14 w15 w16se w16cid w16 w16cex w16sdtdh w16sdtfl w16du wp14">
   <w:endnote w:type="separator" w:id="-1">
     <w:p>
       <w:r>
@@ -1566,19 +1903,19 @@
 </file>
 
 <file path=word/footer1.xml><?xml version="1.0" encoding="utf-8"?>
-<w:ftr xmlns:wpc="http://schemas.microsoft.com/office/word/2010/wordprocessingCanvas" xmlns:cx="http://schemas.microsoft.com/office/drawing/2014/chartex" xmlns:cx1="http://schemas.microsoft.com/office/drawing/2015/9/8/chartex" xmlns:cx2="http://schemas.microsoft.com/office/drawing/2015/10/21/chartex" xmlns:cx3="http://schemas.microsoft.com/office/drawing/2016/5/9/chartex" xmlns:cx4="http://schemas.microsoft.com/office/drawing/2016/5/10/chartex" xmlns:cx5="http://schemas.microsoft.com/office/drawing/2016/5/11/chartex" xmlns:cx6="http://schemas.microsoft.com/office/drawing/2016/5/12/chartex" xmlns:cx7="http://schemas.microsoft.com/office/drawing/2016/5/13/chartex" xmlns:cx8="http://schemas.microsoft.com/office/drawing/2016/5/14/chartex" xmlns:mc="http://schemas.openxmlformats.org/markup-compatibility/2006" xmlns:aink="http://schemas.microsoft.com/office/drawing/2016/ink" xmlns:am3d="http://schemas.microsoft.com/office/drawing/2017/model3d" xmlns:o="urn:schemas-microsoft-com:office:office" xmlns:r="http://schemas.openxmlformats.org/officeDocument/2006/relationships" xmlns:m="http://schemas.openxmlformats.org/officeDocument/2006/math" xmlns:v="urn:schemas-microsoft-com:vml" xmlns:wp14="http://schemas.microsoft.com/office/word/2010/wordprocessingDrawing" xmlns:wp="http://schemas.openxmlformats.org/drawingml/2006/wordprocessingDrawing" xmlns:w10="urn:schemas-microsoft-com:office:word" xmlns:w="http://schemas.openxmlformats.org/wordprocessingml/2006/main" xmlns:w14="http://schemas.microsoft.com/office/word/2010/wordml" xmlns:w15="http://schemas.microsoft.com/office/word/2012/wordml" xmlns:w16cex="http://schemas.microsoft.com/office/word/2018/wordml/cex" xmlns:w16cid="http://schemas.microsoft.com/office/word/2016/wordml/cid" xmlns:w16="http://schemas.microsoft.com/office/word/2018/wordml" xmlns:w16sdtdh="http://schemas.microsoft.com/office/word/2020/wordml/sdtdatahash" xmlns:w16se="http://schemas.microsoft.com/office/word/2015/wordml/symex" xmlns:wpg="http://schemas.microsoft.com/office/word/2010/wordprocessingGroup" xmlns:wpi="http://schemas.microsoft.com/office/word/2010/wordprocessingInk" xmlns:wne="http://schemas.microsoft.com/office/word/2006/wordml" xmlns:wps="http://schemas.microsoft.com/office/word/2010/wordprocessingShape" mc:Ignorable="w14 w15 w16se w16cid w16 w16cex w16sdtdh wp14">
+<w:ftr xmlns:wpc="http://schemas.microsoft.com/office/word/2010/wordprocessingCanvas" xmlns:cx="http://schemas.microsoft.com/office/drawing/2014/chartex" xmlns:cx1="http://schemas.microsoft.com/office/drawing/2015/9/8/chartex" xmlns:cx2="http://schemas.microsoft.com/office/drawing/2015/10/21/chartex" xmlns:cx3="http://schemas.microsoft.com/office/drawing/2016/5/9/chartex" xmlns:cx4="http://schemas.microsoft.com/office/drawing/2016/5/10/chartex" xmlns:cx5="http://schemas.microsoft.com/office/drawing/2016/5/11/chartex" xmlns:cx6="http://schemas.microsoft.com/office/drawing/2016/5/12/chartex" xmlns:cx7="http://schemas.microsoft.com/office/drawing/2016/5/13/chartex" xmlns:cx8="http://schemas.microsoft.com/office/drawing/2016/5/14/chartex" xmlns:mc="http://schemas.openxmlformats.org/markup-compatibility/2006" xmlns:aink="http://schemas.microsoft.com/office/drawing/2016/ink" xmlns:am3d="http://schemas.microsoft.com/office/drawing/2017/model3d" xmlns:o="urn:schemas-microsoft-com:office:office" xmlns:oel="http://schemas.microsoft.com/office/2019/extlst" xmlns:r="http://schemas.openxmlformats.org/officeDocument/2006/relationships" xmlns:m="http://schemas.openxmlformats.org/officeDocument/2006/math" xmlns:v="urn:schemas-microsoft-com:vml" xmlns:wp14="http://schemas.microsoft.com/office/word/2010/wordprocessingDrawing" xmlns:wp="http://schemas.openxmlformats.org/drawingml/2006/wordprocessingDrawing" xmlns:w10="urn:schemas-microsoft-com:office:word" xmlns:w="http://schemas.openxmlformats.org/wordprocessingml/2006/main" xmlns:w14="http://schemas.microsoft.com/office/word/2010/wordml" xmlns:w15="http://schemas.microsoft.com/office/word/2012/wordml" xmlns:w16cex="http://schemas.microsoft.com/office/word/2018/wordml/cex" xmlns:w16cid="http://schemas.microsoft.com/office/word/2016/wordml/cid" xmlns:w16="http://schemas.microsoft.com/office/word/2018/wordml" xmlns:w16du="http://schemas.microsoft.com/office/word/2023/wordml/word16du" xmlns:w16sdtdh="http://schemas.microsoft.com/office/word/2020/wordml/sdtdatahash" xmlns:w16sdtfl="http://schemas.microsoft.com/office/word/2024/wordml/sdtformatlock" xmlns:w16se="http://schemas.microsoft.com/office/word/2015/wordml/symex" xmlns:wpg="http://schemas.microsoft.com/office/word/2010/wordprocessingGroup" xmlns:wpi="http://schemas.microsoft.com/office/word/2010/wordprocessingInk" xmlns:wne="http://schemas.microsoft.com/office/word/2006/wordml" xmlns:wps="http://schemas.microsoft.com/office/word/2010/wordprocessingShape" mc:Ignorable="w14 w15 w16se w16cid w16 w16cex w16sdtdh w16sdtfl w16du wp14">
   <w:p/>
 </w:ftr>
 </file>
 
 <file path=word/footer2.xml><?xml version="1.0" encoding="utf-8"?>
-<w:ftr xmlns:wpc="http://schemas.microsoft.com/office/word/2010/wordprocessingCanvas" xmlns:cx="http://schemas.microsoft.com/office/drawing/2014/chartex" xmlns:cx1="http://schemas.microsoft.com/office/drawing/2015/9/8/chartex" xmlns:cx2="http://schemas.microsoft.com/office/drawing/2015/10/21/chartex" xmlns:cx3="http://schemas.microsoft.com/office/drawing/2016/5/9/chartex" xmlns:cx4="http://schemas.microsoft.com/office/drawing/2016/5/10/chartex" xmlns:cx5="http://schemas.microsoft.com/office/drawing/2016/5/11/chartex" xmlns:cx6="http://schemas.microsoft.com/office/drawing/2016/5/12/chartex" xmlns:cx7="http://schemas.microsoft.com/office/drawing/2016/5/13/chartex" xmlns:cx8="http://schemas.microsoft.com/office/drawing/2016/5/14/chartex" xmlns:mc="http://schemas.openxmlformats.org/markup-compatibility/2006" xmlns:aink="http://schemas.microsoft.com/office/drawing/2016/ink" xmlns:am3d="http://schemas.microsoft.com/office/drawing/2017/model3d" xmlns:o="urn:schemas-microsoft-com:office:office" xmlns:r="http://schemas.openxmlformats.org/officeDocument/2006/relationships" xmlns:m="http://schemas.openxmlformats.org/officeDocument/2006/math" xmlns:v="urn:schemas-microsoft-com:vml" xmlns:wp14="http://schemas.microsoft.com/office/word/2010/wordprocessingDrawing" xmlns:wp="http://schemas.openxmlformats.org/drawingml/2006/wordprocessingDrawing" xmlns:w10="urn:schemas-microsoft-com:office:word" xmlns:w="http://schemas.openxmlformats.org/wordprocessingml/2006/main" xmlns:w14="http://schemas.microsoft.com/office/word/2010/wordml" xmlns:w15="http://schemas.microsoft.com/office/word/2012/wordml" xmlns:w16cex="http://schemas.microsoft.com/office/word/2018/wordml/cex" xmlns:w16cid="http://schemas.microsoft.com/office/word/2016/wordml/cid" xmlns:w16="http://schemas.microsoft.com/office/word/2018/wordml" xmlns:w16sdtdh="http://schemas.microsoft.com/office/word/2020/wordml/sdtdatahash" xmlns:w16se="http://schemas.microsoft.com/office/word/2015/wordml/symex" xmlns:wpg="http://schemas.microsoft.com/office/word/2010/wordprocessingGroup" xmlns:wpi="http://schemas.microsoft.com/office/word/2010/wordprocessingInk" xmlns:wne="http://schemas.microsoft.com/office/word/2006/wordml" xmlns:wps="http://schemas.microsoft.com/office/word/2010/wordprocessingShape" mc:Ignorable="w14 w15 w16se w16cid w16 w16cex w16sdtdh wp14">
+<w:ftr xmlns:wpc="http://schemas.microsoft.com/office/word/2010/wordprocessingCanvas" xmlns:cx="http://schemas.microsoft.com/office/drawing/2014/chartex" xmlns:cx1="http://schemas.microsoft.com/office/drawing/2015/9/8/chartex" xmlns:cx2="http://schemas.microsoft.com/office/drawing/2015/10/21/chartex" xmlns:cx3="http://schemas.microsoft.com/office/drawing/2016/5/9/chartex" xmlns:cx4="http://schemas.microsoft.com/office/drawing/2016/5/10/chartex" xmlns:cx5="http://schemas.microsoft.com/office/drawing/2016/5/11/chartex" xmlns:cx6="http://schemas.microsoft.com/office/drawing/2016/5/12/chartex" xmlns:cx7="http://schemas.microsoft.com/office/drawing/2016/5/13/chartex" xmlns:cx8="http://schemas.microsoft.com/office/drawing/2016/5/14/chartex" xmlns:mc="http://schemas.openxmlformats.org/markup-compatibility/2006" xmlns:aink="http://schemas.microsoft.com/office/drawing/2016/ink" xmlns:am3d="http://schemas.microsoft.com/office/drawing/2017/model3d" xmlns:o="urn:schemas-microsoft-com:office:office" xmlns:oel="http://schemas.microsoft.com/office/2019/extlst" xmlns:r="http://schemas.openxmlformats.org/officeDocument/2006/relationships" xmlns:m="http://schemas.openxmlformats.org/officeDocument/2006/math" xmlns:v="urn:schemas-microsoft-com:vml" xmlns:wp14="http://schemas.microsoft.com/office/word/2010/wordprocessingDrawing" xmlns:wp="http://schemas.openxmlformats.org/drawingml/2006/wordprocessingDrawing" xmlns:w10="urn:schemas-microsoft-com:office:word" xmlns:w="http://schemas.openxmlformats.org/wordprocessingml/2006/main" xmlns:w14="http://schemas.microsoft.com/office/word/2010/wordml" xmlns:w15="http://schemas.microsoft.com/office/word/2012/wordml" xmlns:w16cex="http://schemas.microsoft.com/office/word/2018/wordml/cex" xmlns:w16cid="http://schemas.microsoft.com/office/word/2016/wordml/cid" xmlns:w16="http://schemas.microsoft.com/office/word/2018/wordml" xmlns:w16du="http://schemas.microsoft.com/office/word/2023/wordml/word16du" xmlns:w16sdtdh="http://schemas.microsoft.com/office/word/2020/wordml/sdtdatahash" xmlns:w16sdtfl="http://schemas.microsoft.com/office/word/2024/wordml/sdtformatlock" xmlns:w16se="http://schemas.microsoft.com/office/word/2015/wordml/symex" xmlns:wpg="http://schemas.microsoft.com/office/word/2010/wordprocessingGroup" xmlns:wpi="http://schemas.microsoft.com/office/word/2010/wordprocessingInk" xmlns:wne="http://schemas.microsoft.com/office/word/2006/wordml" xmlns:wps="http://schemas.microsoft.com/office/word/2010/wordprocessingShape" mc:Ignorable="w14 w15 w16se w16cid w16 w16cex w16sdtdh w16sdtfl w16du wp14">
   <w:p/>
 </w:ftr>
 </file>
 
 <file path=word/footnotes.xml><?xml version="1.0" encoding="utf-8"?>
-<w:footnotes xmlns:wpc="http://schemas.microsoft.com/office/word/2010/wordprocessingCanvas" xmlns:cx="http://schemas.microsoft.com/office/drawing/2014/chartex" xmlns:cx1="http://schemas.microsoft.com/office/drawing/2015/9/8/chartex" xmlns:cx2="http://schemas.microsoft.com/office/drawing/2015/10/21/chartex" xmlns:cx3="http://schemas.microsoft.com/office/drawing/2016/5/9/chartex" xmlns:cx4="http://schemas.microsoft.com/office/drawing/2016/5/10/chartex" xmlns:cx5="http://schemas.microsoft.com/office/drawing/2016/5/11/chartex" xmlns:cx6="http://schemas.microsoft.com/office/drawing/2016/5/12/chartex" xmlns:cx7="http://schemas.microsoft.com/office/drawing/2016/5/13/chartex" xmlns:cx8="http://schemas.microsoft.com/office/drawing/2016/5/14/chartex" xmlns:mc="http://schemas.openxmlformats.org/markup-compatibility/2006" xmlns:aink="http://schemas.microsoft.com/office/drawing/2016/ink" xmlns:am3d="http://schemas.microsoft.com/office/drawing/2017/model3d" xmlns:o="urn:schemas-microsoft-com:office:office" xmlns:r="http://schemas.openxmlformats.org/officeDocument/2006/relationships" xmlns:m="http://schemas.openxmlformats.org/officeDocument/2006/math" xmlns:v="urn:schemas-microsoft-com:vml" xmlns:wp14="http://schemas.microsoft.com/office/word/2010/wordprocessingDrawing" xmlns:wp="http://schemas.openxmlformats.org/drawingml/2006/wordprocessingDrawing" xmlns:w10="urn:schemas-microsoft-com:office:word" xmlns:w="http://schemas.openxmlformats.org/wordprocessingml/2006/main" xmlns:w14="http://schemas.microsoft.com/office/word/2010/wordml" xmlns:w15="http://schemas.microsoft.com/office/word/2012/wordml" xmlns:w16cex="http://schemas.microsoft.com/office/word/2018/wordml/cex" xmlns:w16cid="http://schemas.microsoft.com/office/word/2016/wordml/cid" xmlns:w16="http://schemas.microsoft.com/office/word/2018/wordml" xmlns:w16sdtdh="http://schemas.microsoft.com/office/word/2020/wordml/sdtdatahash" xmlns:w16se="http://schemas.microsoft.com/office/word/2015/wordml/symex" xmlns:wpg="http://schemas.microsoft.com/office/word/2010/wordprocessingGroup" xmlns:wpi="http://schemas.microsoft.com/office/word/2010/wordprocessingInk" xmlns:wne="http://schemas.microsoft.com/office/word/2006/wordml" xmlns:wps="http://schemas.microsoft.com/office/word/2010/wordprocessingShape" mc:Ignorable="w14 w15 w16se w16cid w16 w16cex w16sdtdh wp14">
+<w:footnotes xmlns:wpc="http://schemas.microsoft.com/office/word/2010/wordprocessingCanvas" xmlns:cx="http://schemas.microsoft.com/office/drawing/2014/chartex" xmlns:cx1="http://schemas.microsoft.com/office/drawing/2015/9/8/chartex" xmlns:cx2="http://schemas.microsoft.com/office/drawing/2015/10/21/chartex" xmlns:cx3="http://schemas.microsoft.com/office/drawing/2016/5/9/chartex" xmlns:cx4="http://schemas.microsoft.com/office/drawing/2016/5/10/chartex" xmlns:cx5="http://schemas.microsoft.com/office/drawing/2016/5/11/chartex" xmlns:cx6="http://schemas.microsoft.com/office/drawing/2016/5/12/chartex" xmlns:cx7="http://schemas.microsoft.com/office/drawing/2016/5/13/chartex" xmlns:cx8="http://schemas.microsoft.com/office/drawing/2016/5/14/chartex" xmlns:mc="http://schemas.openxmlformats.org/markup-compatibility/2006" xmlns:aink="http://schemas.microsoft.com/office/drawing/2016/ink" xmlns:am3d="http://schemas.microsoft.com/office/drawing/2017/model3d" xmlns:o="urn:schemas-microsoft-com:office:office" xmlns:oel="http://schemas.microsoft.com/office/2019/extlst" xmlns:r="http://schemas.openxmlformats.org/officeDocument/2006/relationships" xmlns:m="http://schemas.openxmlformats.org/officeDocument/2006/math" xmlns:v="urn:schemas-microsoft-com:vml" xmlns:wp14="http://schemas.microsoft.com/office/word/2010/wordprocessingDrawing" xmlns:wp="http://schemas.openxmlformats.org/drawingml/2006/wordprocessingDrawing" xmlns:w10="urn:schemas-microsoft-com:office:word" xmlns:w="http://schemas.openxmlformats.org/wordprocessingml/2006/main" xmlns:w14="http://schemas.microsoft.com/office/word/2010/wordml" xmlns:w15="http://schemas.microsoft.com/office/word/2012/wordml" xmlns:w16cex="http://schemas.microsoft.com/office/word/2018/wordml/cex" xmlns:w16cid="http://schemas.microsoft.com/office/word/2016/wordml/cid" xmlns:w16="http://schemas.microsoft.com/office/word/2018/wordml" xmlns:w16du="http://schemas.microsoft.com/office/word/2023/wordml/word16du" xmlns:w16sdtdh="http://schemas.microsoft.com/office/word/2020/wordml/sdtdatahash" xmlns:w16sdtfl="http://schemas.microsoft.com/office/word/2024/wordml/sdtformatlock" xmlns:w16se="http://schemas.microsoft.com/office/word/2015/wordml/symex" xmlns:wpg="http://schemas.microsoft.com/office/word/2010/wordprocessingGroup" xmlns:wpi="http://schemas.microsoft.com/office/word/2010/wordprocessingInk" xmlns:wne="http://schemas.microsoft.com/office/word/2006/wordml" xmlns:wps="http://schemas.microsoft.com/office/word/2010/wordprocessingShape" mc:Ignorable="w14 w15 w16se w16cid w16 w16cex w16sdtdh w16sdtfl w16du wp14">
   <w:footnote w:type="separator" w:id="-1">
     <w:p>
       <w:r>
@@ -1597,13 +1934,13 @@
 </file>
 
 <file path=word/header1.xml><?xml version="1.0" encoding="utf-8"?>
-<w:hdr xmlns:wpc="http://schemas.microsoft.com/office/word/2010/wordprocessingCanvas" xmlns:cx="http://schemas.microsoft.com/office/drawing/2014/chartex" xmlns:cx1="http://schemas.microsoft.com/office/drawing/2015/9/8/chartex" xmlns:cx2="http://schemas.microsoft.com/office/drawing/2015/10/21/chartex" xmlns:cx3="http://schemas.microsoft.com/office/drawing/2016/5/9/chartex" xmlns:cx4="http://schemas.microsoft.com/office/drawing/2016/5/10/chartex" xmlns:cx5="http://schemas.microsoft.com/office/drawing/2016/5/11/chartex" xmlns:cx6="http://schemas.microsoft.com/office/drawing/2016/5/12/chartex" xmlns:cx7="http://schemas.microsoft.com/office/drawing/2016/5/13/chartex" xmlns:cx8="http://schemas.microsoft.com/office/drawing/2016/5/14/chartex" xmlns:mc="http://schemas.openxmlformats.org/markup-compatibility/2006" xmlns:aink="http://schemas.microsoft.com/office/drawing/2016/ink" xmlns:am3d="http://schemas.microsoft.com/office/drawing/2017/model3d" xmlns:o="urn:schemas-microsoft-com:office:office" xmlns:r="http://schemas.openxmlformats.org/officeDocument/2006/relationships" xmlns:m="http://schemas.openxmlformats.org/officeDocument/2006/math" xmlns:v="urn:schemas-microsoft-com:vml" xmlns:wp14="http://schemas.microsoft.com/office/word/2010/wordprocessingDrawing" xmlns:wp="http://schemas.openxmlformats.org/drawingml/2006/wordprocessingDrawing" xmlns:w10="urn:schemas-microsoft-com:office:word" xmlns:w="http://schemas.openxmlformats.org/wordprocessingml/2006/main" xmlns:w14="http://schemas.microsoft.com/office/word/2010/wordml" xmlns:w15="http://schemas.microsoft.com/office/word/2012/wordml" xmlns:w16cex="http://schemas.microsoft.com/office/word/2018/wordml/cex" xmlns:w16cid="http://schemas.microsoft.com/office/word/2016/wordml/cid" xmlns:w16="http://schemas.microsoft.com/office/word/2018/wordml" xmlns:w16sdtdh="http://schemas.microsoft.com/office/word/2020/wordml/sdtdatahash" xmlns:w16se="http://schemas.microsoft.com/office/word/2015/wordml/symex" xmlns:wpg="http://schemas.microsoft.com/office/word/2010/wordprocessingGroup" xmlns:wpi="http://schemas.microsoft.com/office/word/2010/wordprocessingInk" xmlns:wne="http://schemas.microsoft.com/office/word/2006/wordml" xmlns:wps="http://schemas.microsoft.com/office/word/2010/wordprocessingShape" mc:Ignorable="w14 w15 w16se w16cid w16 w16cex w16sdtdh wp14">
+<w:hdr xmlns:wpc="http://schemas.microsoft.com/office/word/2010/wordprocessingCanvas" xmlns:cx="http://schemas.microsoft.com/office/drawing/2014/chartex" xmlns:cx1="http://schemas.microsoft.com/office/drawing/2015/9/8/chartex" xmlns:cx2="http://schemas.microsoft.com/office/drawing/2015/10/21/chartex" xmlns:cx3="http://schemas.microsoft.com/office/drawing/2016/5/9/chartex" xmlns:cx4="http://schemas.microsoft.com/office/drawing/2016/5/10/chartex" xmlns:cx5="http://schemas.microsoft.com/office/drawing/2016/5/11/chartex" xmlns:cx6="http://schemas.microsoft.com/office/drawing/2016/5/12/chartex" xmlns:cx7="http://schemas.microsoft.com/office/drawing/2016/5/13/chartex" xmlns:cx8="http://schemas.microsoft.com/office/drawing/2016/5/14/chartex" xmlns:mc="http://schemas.openxmlformats.org/markup-compatibility/2006" xmlns:aink="http://schemas.microsoft.com/office/drawing/2016/ink" xmlns:am3d="http://schemas.microsoft.com/office/drawing/2017/model3d" xmlns:o="urn:schemas-microsoft-com:office:office" xmlns:oel="http://schemas.microsoft.com/office/2019/extlst" xmlns:r="http://schemas.openxmlformats.org/officeDocument/2006/relationships" xmlns:m="http://schemas.openxmlformats.org/officeDocument/2006/math" xmlns:v="urn:schemas-microsoft-com:vml" xmlns:wp14="http://schemas.microsoft.com/office/word/2010/wordprocessingDrawing" xmlns:wp="http://schemas.openxmlformats.org/drawingml/2006/wordprocessingDrawing" xmlns:w10="urn:schemas-microsoft-com:office:word" xmlns:w="http://schemas.openxmlformats.org/wordprocessingml/2006/main" xmlns:w14="http://schemas.microsoft.com/office/word/2010/wordml" xmlns:w15="http://schemas.microsoft.com/office/word/2012/wordml" xmlns:w16cex="http://schemas.microsoft.com/office/word/2018/wordml/cex" xmlns:w16cid="http://schemas.microsoft.com/office/word/2016/wordml/cid" xmlns:w16="http://schemas.microsoft.com/office/word/2018/wordml" xmlns:w16du="http://schemas.microsoft.com/office/word/2023/wordml/word16du" xmlns:w16sdtdh="http://schemas.microsoft.com/office/word/2020/wordml/sdtdatahash" xmlns:w16sdtfl="http://schemas.microsoft.com/office/word/2024/wordml/sdtformatlock" xmlns:w16se="http://schemas.microsoft.com/office/word/2015/wordml/symex" xmlns:wpg="http://schemas.microsoft.com/office/word/2010/wordprocessingGroup" xmlns:wpi="http://schemas.microsoft.com/office/word/2010/wordprocessingInk" xmlns:wne="http://schemas.microsoft.com/office/word/2006/wordml" xmlns:wps="http://schemas.microsoft.com/office/word/2010/wordprocessingShape" mc:Ignorable="w14 w15 w16se w16cid w16 w16cex w16sdtdh w16sdtfl w16du wp14">
   <w:p/>
 </w:hdr>
 </file>
 
 <file path=word/header2.xml><?xml version="1.0" encoding="utf-8"?>
-<w:hdr xmlns:wpc="http://schemas.microsoft.com/office/word/2010/wordprocessingCanvas" xmlns:cx="http://schemas.microsoft.com/office/drawing/2014/chartex" xmlns:cx1="http://schemas.microsoft.com/office/drawing/2015/9/8/chartex" xmlns:cx2="http://schemas.microsoft.com/office/drawing/2015/10/21/chartex" xmlns:cx3="http://schemas.microsoft.com/office/drawing/2016/5/9/chartex" xmlns:cx4="http://schemas.microsoft.com/office/drawing/2016/5/10/chartex" xmlns:cx5="http://schemas.microsoft.com/office/drawing/2016/5/11/chartex" xmlns:cx6="http://schemas.microsoft.com/office/drawing/2016/5/12/chartex" xmlns:cx7="http://schemas.microsoft.com/office/drawing/2016/5/13/chartex" xmlns:cx8="http://schemas.microsoft.com/office/drawing/2016/5/14/chartex" xmlns:mc="http://schemas.openxmlformats.org/markup-compatibility/2006" xmlns:aink="http://schemas.microsoft.com/office/drawing/2016/ink" xmlns:am3d="http://schemas.microsoft.com/office/drawing/2017/model3d" xmlns:o="urn:schemas-microsoft-com:office:office" xmlns:r="http://schemas.openxmlformats.org/officeDocument/2006/relationships" xmlns:m="http://schemas.openxmlformats.org/officeDocument/2006/math" xmlns:v="urn:schemas-microsoft-com:vml" xmlns:wp14="http://schemas.microsoft.com/office/word/2010/wordprocessingDrawing" xmlns:wp="http://schemas.openxmlformats.org/drawingml/2006/wordprocessingDrawing" xmlns:w10="urn:schemas-microsoft-com:office:word" xmlns:w="http://schemas.openxmlformats.org/wordprocessingml/2006/main" xmlns:w14="http://schemas.microsoft.com/office/word/2010/wordml" xmlns:w15="http://schemas.microsoft.com/office/word/2012/wordml" xmlns:w16cex="http://schemas.microsoft.com/office/word/2018/wordml/cex" xmlns:w16cid="http://schemas.microsoft.com/office/word/2016/wordml/cid" xmlns:w16="http://schemas.microsoft.com/office/word/2018/wordml" xmlns:w16sdtdh="http://schemas.microsoft.com/office/word/2020/wordml/sdtdatahash" xmlns:w16se="http://schemas.microsoft.com/office/word/2015/wordml/symex" xmlns:wpg="http://schemas.microsoft.com/office/word/2010/wordprocessingGroup" xmlns:wpi="http://schemas.microsoft.com/office/word/2010/wordprocessingInk" xmlns:wne="http://schemas.microsoft.com/office/word/2006/wordml" xmlns:wps="http://schemas.microsoft.com/office/word/2010/wordprocessingShape" mc:Ignorable="w14 w15 w16se w16cid w16 w16cex w16sdtdh wp14">
+<w:hdr xmlns:wpc="http://schemas.microsoft.com/office/word/2010/wordprocessingCanvas" xmlns:cx="http://schemas.microsoft.com/office/drawing/2014/chartex" xmlns:cx1="http://schemas.microsoft.com/office/drawing/2015/9/8/chartex" xmlns:cx2="http://schemas.microsoft.com/office/drawing/2015/10/21/chartex" xmlns:cx3="http://schemas.microsoft.com/office/drawing/2016/5/9/chartex" xmlns:cx4="http://schemas.microsoft.com/office/drawing/2016/5/10/chartex" xmlns:cx5="http://schemas.microsoft.com/office/drawing/2016/5/11/chartex" xmlns:cx6="http://schemas.microsoft.com/office/drawing/2016/5/12/chartex" xmlns:cx7="http://schemas.microsoft.com/office/drawing/2016/5/13/chartex" xmlns:cx8="http://schemas.microsoft.com/office/drawing/2016/5/14/chartex" xmlns:mc="http://schemas.openxmlformats.org/markup-compatibility/2006" xmlns:aink="http://schemas.microsoft.com/office/drawing/2016/ink" xmlns:am3d="http://schemas.microsoft.com/office/drawing/2017/model3d" xmlns:o="urn:schemas-microsoft-com:office:office" xmlns:oel="http://schemas.microsoft.com/office/2019/extlst" xmlns:r="http://schemas.openxmlformats.org/officeDocument/2006/relationships" xmlns:m="http://schemas.openxmlformats.org/officeDocument/2006/math" xmlns:v="urn:schemas-microsoft-com:vml" xmlns:wp14="http://schemas.microsoft.com/office/word/2010/wordprocessingDrawing" xmlns:wp="http://schemas.openxmlformats.org/drawingml/2006/wordprocessingDrawing" xmlns:w10="urn:schemas-microsoft-com:office:word" xmlns:w="http://schemas.openxmlformats.org/wordprocessingml/2006/main" xmlns:w14="http://schemas.microsoft.com/office/word/2010/wordml" xmlns:w15="http://schemas.microsoft.com/office/word/2012/wordml" xmlns:w16cex="http://schemas.microsoft.com/office/word/2018/wordml/cex" xmlns:w16cid="http://schemas.microsoft.com/office/word/2016/wordml/cid" xmlns:w16="http://schemas.microsoft.com/office/word/2018/wordml" xmlns:w16du="http://schemas.microsoft.com/office/word/2023/wordml/word16du" xmlns:w16sdtdh="http://schemas.microsoft.com/office/word/2020/wordml/sdtdatahash" xmlns:w16sdtfl="http://schemas.microsoft.com/office/word/2024/wordml/sdtformatlock" xmlns:w16se="http://schemas.microsoft.com/office/word/2015/wordml/symex" xmlns:wpg="http://schemas.microsoft.com/office/word/2010/wordprocessingGroup" xmlns:wpi="http://schemas.microsoft.com/office/word/2010/wordprocessingInk" xmlns:wne="http://schemas.microsoft.com/office/word/2006/wordml" xmlns:wps="http://schemas.microsoft.com/office/word/2010/wordprocessingShape" mc:Ignorable="w14 w15 w16se w16cid w16 w16cex w16sdtdh w16sdtfl w16du wp14">
   <w:tbl>
     <w:tblPr>
       <w:tblW w:w="0" w:type="auto"/>
@@ -1824,7 +2161,7 @@
 </file>
 
 <file path=word/numbering.xml><?xml version="1.0" encoding="utf-8"?>
-<w:numbering xmlns:wpc="http://schemas.microsoft.com/office/word/2010/wordprocessingCanvas" xmlns:cx="http://schemas.microsoft.com/office/drawing/2014/chartex" xmlns:cx1="http://schemas.microsoft.com/office/drawing/2015/9/8/chartex" xmlns:cx2="http://schemas.microsoft.com/office/drawing/2015/10/21/chartex" xmlns:cx3="http://schemas.microsoft.com/office/drawing/2016/5/9/chartex" xmlns:cx4="http://schemas.microsoft.com/office/drawing/2016/5/10/chartex" xmlns:cx5="http://schemas.microsoft.com/office/drawing/2016/5/11/chartex" xmlns:cx6="http://schemas.microsoft.com/office/drawing/2016/5/12/chartex" xmlns:cx7="http://schemas.microsoft.com/office/drawing/2016/5/13/chartex" xmlns:cx8="http://schemas.microsoft.com/office/drawing/2016/5/14/chartex" xmlns:mc="http://schemas.openxmlformats.org/markup-compatibility/2006" xmlns:aink="http://schemas.microsoft.com/office/drawing/2016/ink" xmlns:am3d="http://schemas.microsoft.com/office/drawing/2017/model3d" xmlns:o="urn:schemas-microsoft-com:office:office" xmlns:r="http://schemas.openxmlformats.org/officeDocument/2006/relationships" xmlns:m="http://schemas.openxmlformats.org/officeDocument/2006/math" xmlns:v="urn:schemas-microsoft-com:vml" xmlns:wp14="http://schemas.microsoft.com/office/word/2010/wordprocessingDrawing" xmlns:wp="http://schemas.openxmlformats.org/drawingml/2006/wordprocessingDrawing" xmlns:w10="urn:schemas-microsoft-com:office:word" xmlns:w="http://schemas.openxmlformats.org/wordprocessingml/2006/main" xmlns:w14="http://schemas.microsoft.com/office/word/2010/wordml" xmlns:w15="http://schemas.microsoft.com/office/word/2012/wordml" xmlns:w16cex="http://schemas.microsoft.com/office/word/2018/wordml/cex" xmlns:w16cid="http://schemas.microsoft.com/office/word/2016/wordml/cid" xmlns:w16="http://schemas.microsoft.com/office/word/2018/wordml" xmlns:w16sdtdh="http://schemas.microsoft.com/office/word/2020/wordml/sdtdatahash" xmlns:w16se="http://schemas.microsoft.com/office/word/2015/wordml/symex" xmlns:wpg="http://schemas.microsoft.com/office/word/2010/wordprocessingGroup" xmlns:wpi="http://schemas.microsoft.com/office/word/2010/wordprocessingInk" xmlns:wne="http://schemas.microsoft.com/office/word/2006/wordml" xmlns:wps="http://schemas.microsoft.com/office/word/2010/wordprocessingShape" mc:Ignorable="w14 w15 w16se w16cid w16 w16cex w16sdtdh wp14">
+<w:numbering xmlns:wpc="http://schemas.microsoft.com/office/word/2010/wordprocessingCanvas" xmlns:cx="http://schemas.microsoft.com/office/drawing/2014/chartex" xmlns:cx1="http://schemas.microsoft.com/office/drawing/2015/9/8/chartex" xmlns:cx2="http://schemas.microsoft.com/office/drawing/2015/10/21/chartex" xmlns:cx3="http://schemas.microsoft.com/office/drawing/2016/5/9/chartex" xmlns:cx4="http://schemas.microsoft.com/office/drawing/2016/5/10/chartex" xmlns:cx5="http://schemas.microsoft.com/office/drawing/2016/5/11/chartex" xmlns:cx6="http://schemas.microsoft.com/office/drawing/2016/5/12/chartex" xmlns:cx7="http://schemas.microsoft.com/office/drawing/2016/5/13/chartex" xmlns:cx8="http://schemas.microsoft.com/office/drawing/2016/5/14/chartex" xmlns:mc="http://schemas.openxmlformats.org/markup-compatibility/2006" xmlns:aink="http://schemas.microsoft.com/office/drawing/2016/ink" xmlns:am3d="http://schemas.microsoft.com/office/drawing/2017/model3d" xmlns:o="urn:schemas-microsoft-com:office:office" xmlns:oel="http://schemas.microsoft.com/office/2019/extlst" xmlns:r="http://schemas.openxmlformats.org/officeDocument/2006/relationships" xmlns:m="http://schemas.openxmlformats.org/officeDocument/2006/math" xmlns:v="urn:schemas-microsoft-com:vml" xmlns:wp14="http://schemas.microsoft.com/office/word/2010/wordprocessingDrawing" xmlns:wp="http://schemas.openxmlformats.org/drawingml/2006/wordprocessingDrawing" xmlns:w10="urn:schemas-microsoft-com:office:word" xmlns:w="http://schemas.openxmlformats.org/wordprocessingml/2006/main" xmlns:w14="http://schemas.microsoft.com/office/word/2010/wordml" xmlns:w15="http://schemas.microsoft.com/office/word/2012/wordml" xmlns:w16cex="http://schemas.microsoft.com/office/word/2018/wordml/cex" xmlns:w16cid="http://schemas.microsoft.com/office/word/2016/wordml/cid" xmlns:w16="http://schemas.microsoft.com/office/word/2018/wordml" xmlns:w16du="http://schemas.microsoft.com/office/word/2023/wordml/word16du" xmlns:w16sdtdh="http://schemas.microsoft.com/office/word/2020/wordml/sdtdatahash" xmlns:w16sdtfl="http://schemas.microsoft.com/office/word/2024/wordml/sdtformatlock" xmlns:w16se="http://schemas.microsoft.com/office/word/2015/wordml/symex" xmlns:wpg="http://schemas.microsoft.com/office/word/2010/wordprocessingGroup" xmlns:wpi="http://schemas.microsoft.com/office/word/2010/wordprocessingInk" xmlns:wne="http://schemas.microsoft.com/office/word/2006/wordml" xmlns:wps="http://schemas.microsoft.com/office/word/2010/wordprocessingShape" mc:Ignorable="w14 w15 w16se w16cid w16 w16cex w16sdtdh w16sdtfl w16du wp14">
   <w:abstractNum w:abstractNumId="0" w15:restartNumberingAfterBreak="0">
     <w:nsid w:val="2E7917D1"/>
     <w:multiLevelType w:val="hybridMultilevel"/>
@@ -1911,14 +2248,14 @@
       </w:pPr>
     </w:lvl>
   </w:abstractNum>
-  <w:num w:numId="1">
+  <w:num w:numId="1" w16cid:durableId="593056213">
     <w:abstractNumId w:val="0"/>
   </w:num>
 </w:numbering>
 </file>
 
 <file path=word/styles.xml><?xml version="1.0" encoding="utf-8"?>
-<w:styles xmlns:mc="http://schemas.openxmlformats.org/markup-compatibility/2006" xmlns:r="http://schemas.openxmlformats.org/officeDocument/2006/relationships" xmlns:w="http://schemas.openxmlformats.org/wordprocessingml/2006/main" xmlns:w14="http://schemas.microsoft.com/office/word/2010/wordml" xmlns:w15="http://schemas.microsoft.com/office/word/2012/wordml" xmlns:w16cex="http://schemas.microsoft.com/office/word/2018/wordml/cex" xmlns:w16cid="http://schemas.microsoft.com/office/word/2016/wordml/cid" xmlns:w16="http://schemas.microsoft.com/office/word/2018/wordml" xmlns:w16sdtdh="http://schemas.microsoft.com/office/word/2020/wordml/sdtdatahash" xmlns:w16se="http://schemas.microsoft.com/office/word/2015/wordml/symex" mc:Ignorable="w14 w15 w16se w16cid w16 w16cex w16sdtdh">
+<w:styles xmlns:mc="http://schemas.openxmlformats.org/markup-compatibility/2006" xmlns:r="http://schemas.openxmlformats.org/officeDocument/2006/relationships" xmlns:w="http://schemas.openxmlformats.org/wordprocessingml/2006/main" xmlns:w14="http://schemas.microsoft.com/office/word/2010/wordml" xmlns:w15="http://schemas.microsoft.com/office/word/2012/wordml" xmlns:w16cex="http://schemas.microsoft.com/office/word/2018/wordml/cex" xmlns:w16cid="http://schemas.microsoft.com/office/word/2016/wordml/cid" xmlns:w16="http://schemas.microsoft.com/office/word/2018/wordml" xmlns:w16du="http://schemas.microsoft.com/office/word/2023/wordml/word16du" xmlns:w16sdtdh="http://schemas.microsoft.com/office/word/2020/wordml/sdtdatahash" xmlns:w16sdtfl="http://schemas.microsoft.com/office/word/2024/wordml/sdtformatlock" xmlns:w16se="http://schemas.microsoft.com/office/word/2015/wordml/symex" mc:Ignorable="w14 w15 w16se w16cid w16 w16cex w16sdtdh w16sdtfl w16du">
   <w:docDefaults>
     <w:rPrDefault>
       <w:rPr>

</xml_diff>